<commit_message>
fix: proper XML run merge for text replacements + year 2025→2026
</commit_message>
<xml_diff>
--- a/рассл4.docx
+++ b/рассл4.docx
@@ -618,21 +618,7 @@
           <w:sz w:val="28"/>
           <w:szCs w:val="28"/>
         </w:rPr>
-        <w:t>Обучающийся</w:t>
-      </w:r>
-      <w:r>
-        <w:rPr>
-          <w:sz w:val="28"/>
-          <w:szCs w:val="28"/>
-        </w:rPr>
-        <w:t xml:space="preserve"> </w:t>
-      </w:r>
-      <w:r>
-        <w:rPr>
-          <w:sz w:val="28"/>
-          <w:szCs w:val="28"/>
-        </w:rPr>
-        <w:t>Макарова Ксения Алексеевна</w:t>
+        <w:t>Обучающийся Силин Егор Игоревич</w:t>
       </w:r>
     </w:p>
     <w:p/>
@@ -1058,7 +1044,7 @@
           <w:sz w:val="28"/>
           <w:szCs w:val="28"/>
         </w:rPr>
-        <w:t>2025</w:t>
+        <w:t>2026</w:t>
       </w:r>
     </w:p>
     <w:p/>

</xml_diff>

<commit_message>
improve: fix gendered verbs, expand descriptions, add text for removed screenshots
</commit_message>
<xml_diff>
--- a/рассл4.docx
+++ b/рассл4.docx
@@ -2101,25 +2101,7 @@
           <w:sz w:val="28"/>
           <w:szCs w:val="28"/>
         </w:rPr>
-        <w:t>0x00000017 = 23</w:t>
-      </w:r>
-      <w:r>
-        <w:rPr>
-          <w:rFonts w:ascii="Times New Roman" w:eastAsia="Times New Roman" w:hAnsi="Times New Roman" w:cs="Times New Roman"/>
-          <w:bCs/>
-          <w:sz w:val="28"/>
-          <w:szCs w:val="28"/>
-        </w:rPr>
-        <w:t>,</w:t>
-      </w:r>
-      <w:r>
-        <w:rPr>
-          <w:rFonts w:ascii="Times New Roman" w:eastAsia="Times New Roman" w:hAnsi="Times New Roman" w:cs="Times New Roman"/>
-          <w:bCs/>
-          <w:sz w:val="28"/>
-          <w:szCs w:val="28"/>
-        </w:rPr>
-        <w:t xml:space="preserve"> что совпадает с размером файла.</w:t>
+        <w:t>Анализ шестнадцатеричного дампа inode-записи: значение 0x00000017 = 23 байта — совпадает с реальным размером файла. Это подтверждает, что поле i_size в структуре inode корректно отражает количество байт данных.</w:t>
       </w:r>
     </w:p>
     <w:p>
@@ -2141,7 +2123,7 @@
           <w:sz w:val="28"/>
           <w:szCs w:val="28"/>
         </w:rPr>
-        <w:t>Количество экстентов – 1.</w:t>
+        <w:t>Количество экстентов — 1. Файл небольшого размера и занимает непрерывный блок данных на диске, что является оптимальной ситуацией с точки зрения производительности чтения.</w:t>
       </w:r>
     </w:p>
     <w:p>

</xml_diff>